<commit_message>
sebelum bimbingan bab I
</commit_message>
<xml_diff>
--- a/pengajuan proposal/Proposal Pengajuan Dana - Raiya Yusuf Priatmojo - 22518244004.docx
+++ b/pengajuan proposal/Proposal Pengajuan Dana - Raiya Yusuf Priatmojo - 22518244004.docx
@@ -2065,7 +2065,23 @@
           <w:sz w:val="24"/>
           <w:szCs w:val="24"/>
         </w:rPr>
-        <w:t>Target penelitian ini adalah peserta didik jenjang menengah (SMP-SMA) di CV Global Solusi Edukasi. Subjek penelitian berjumlah 30 peserta didik yang akan menjadi responden dalam uji coba kepraktisan produk media pembelajaran yang dikembangkan.</w:t>
+        <w:t xml:space="preserve">Target penelitian ini adalah peserta didik jenjang menengah (SMP-SMA) di CV Global Solusi Edukasi. Subjek penelitian berjumlah 30 peserta didik </w:t>
+      </w:r>
+      <w:r>
+        <w:rPr>
+          <w:rFonts w:ascii="Times New Roman" w:eastAsia="Times New Roman" w:hAnsi="Times New Roman" w:cs="Times New Roman"/>
+          <w:sz w:val="24"/>
+          <w:szCs w:val="24"/>
+        </w:rPr>
+        <w:t xml:space="preserve">atau mentor aktif </w:t>
+      </w:r>
+      <w:r>
+        <w:rPr>
+          <w:rFonts w:ascii="Times New Roman" w:eastAsia="Times New Roman" w:hAnsi="Times New Roman" w:cs="Times New Roman"/>
+          <w:sz w:val="24"/>
+          <w:szCs w:val="24"/>
+        </w:rPr>
+        <w:t>yang akan menjadi responden dalam uji coba kepraktisan produk media pembelajaran yang dikembangkan.</w:t>
       </w:r>
     </w:p>
     <w:p>
@@ -2213,7 +2229,27 @@
           <w:sz w:val="24"/>
           <w:szCs w:val="24"/>
         </w:rPr>
-        <w:t xml:space="preserve"> Oktober hingga Desember 2026</w:t>
+        <w:t xml:space="preserve"> Oktober hingga </w:t>
+      </w:r>
+      <w:r>
+        <w:rPr>
+          <w:rFonts w:ascii="Times New Roman" w:eastAsia="Times New Roman" w:hAnsi="Times New Roman" w:cs="Times New Roman"/>
+          <w:b/>
+          <w:bCs/>
+          <w:sz w:val="24"/>
+          <w:szCs w:val="24"/>
+        </w:rPr>
+        <w:t xml:space="preserve">sebelum </w:t>
+      </w:r>
+      <w:r>
+        <w:rPr>
+          <w:rFonts w:ascii="Times New Roman" w:eastAsia="Times New Roman" w:hAnsi="Times New Roman" w:cs="Times New Roman"/>
+          <w:b/>
+          <w:bCs/>
+          <w:sz w:val="24"/>
+          <w:szCs w:val="24"/>
+        </w:rPr>
+        <w:t>Desember 2026</w:t>
       </w:r>
       <w:r>
         <w:rPr>
@@ -2585,7 +2621,63 @@
           <w:sz w:val="24"/>
           <w:szCs w:val="24"/>
         </w:rPr>
-        <w:t>Penelitian ini dilaksanakan selama 3 bulan, mulai dari bulan Oktober 2026 hingga Desember 2026. Rentang waktu tersebut mencakup seluruh tahapan penelitian pengembangan yang mengacu pada model ADDIE, yaitu Analysis, Design, Development, Implementation, dan Evaluation. Penelitian ini direncanakan selesai pada bulan Desember 2026. Secara rinci, jadwal pelaksanaan penelitian dijabarkan pada tabel sebagai berikut:</w:t>
+        <w:t>Penelitian ini dilaksanakan selama 3 bulan, mulai dari bulan Oktober 2026 hingga Desember 2026</w:t>
+      </w:r>
+      <w:r>
+        <w:rPr>
+          <w:rFonts w:ascii="Times New Roman" w:eastAsia="Times New Roman" w:hAnsi="Times New Roman" w:cs="Times New Roman"/>
+          <w:sz w:val="24"/>
+          <w:szCs w:val="24"/>
+        </w:rPr>
+        <w:t xml:space="preserve"> </w:t>
+      </w:r>
+      <w:r>
+        <w:rPr>
+          <w:rFonts w:ascii="Times New Roman" w:eastAsia="Times New Roman" w:hAnsi="Times New Roman" w:cs="Times New Roman"/>
+          <w:b/>
+          <w:bCs/>
+          <w:sz w:val="24"/>
+          <w:szCs w:val="24"/>
+        </w:rPr>
+        <w:t>(</w:t>
+      </w:r>
+      <w:r>
+        <w:rPr>
+          <w:rFonts w:ascii="Times New Roman" w:eastAsia="Times New Roman" w:hAnsi="Times New Roman" w:cs="Times New Roman"/>
+          <w:b/>
+          <w:bCs/>
+          <w:sz w:val="24"/>
+          <w:szCs w:val="24"/>
+        </w:rPr>
+        <w:t>Target utama selesai sebelum bulan Desember</w:t>
+      </w:r>
+      <w:r>
+        <w:rPr>
+          <w:rFonts w:ascii="Times New Roman" w:eastAsia="Times New Roman" w:hAnsi="Times New Roman" w:cs="Times New Roman"/>
+          <w:b/>
+          <w:bCs/>
+          <w:sz w:val="24"/>
+          <w:szCs w:val="24"/>
+        </w:rPr>
+        <w:t>)</w:t>
+      </w:r>
+      <w:r>
+        <w:rPr>
+          <w:rFonts w:ascii="Times New Roman" w:eastAsia="Times New Roman" w:hAnsi="Times New Roman" w:cs="Times New Roman"/>
+          <w:b/>
+          <w:bCs/>
+          <w:sz w:val="24"/>
+          <w:szCs w:val="24"/>
+        </w:rPr>
+        <w:t>.</w:t>
+      </w:r>
+      <w:r>
+        <w:rPr>
+          <w:rFonts w:ascii="Times New Roman" w:eastAsia="Times New Roman" w:hAnsi="Times New Roman" w:cs="Times New Roman"/>
+          <w:sz w:val="24"/>
+          <w:szCs w:val="24"/>
+        </w:rPr>
+        <w:t xml:space="preserve"> Rentang waktu tersebut mencakup seluruh tahapan penelitian pengembangan yang mengacu pada model ADDIE, yaitu Analysis, Design, Development, Implementation, dan Evaluation. Penelitian ini direncanakan selesai pada bulan Desember 2026. Secara rinci, jadwal pelaksanaan penelitian dijabarkan pada tabel sebagai berikut:</w:t>
       </w:r>
     </w:p>
     <w:tbl>
@@ -3842,15 +3934,6 @@
           <w:szCs w:val="24"/>
         </w:rPr>
       </w:pPr>
-      <w:r>
-        <w:rPr>
-          <w:rFonts w:ascii="Times New Roman" w:eastAsia="Times New Roman" w:hAnsi="Times New Roman" w:cs="Times New Roman"/>
-          <w:sz w:val="24"/>
-          <w:szCs w:val="24"/>
-        </w:rPr>
-        <w:lastRenderedPageBreak/>
-        <w:t>Besar harapan penulis agar proposal pengajuan dana ini dapat disetujui dan didukung oleh CV Global Solusi Edukasi. Dukungan tersebut akan sangat berarti bagi kelancaran penelitian dan pengembangan media pembelajaran ini, terutama dalam hal pengadaan komponen-komponen yang dibutuhkan untuk pembuatan trainer kit. Dengan dukungan tersebut, penelitian ini diharapkan dapat menghasilkan produk media pembelajaran yang valid, praktis, dan bermanfaat bagi peserta didik jenjang menengah di CV Global Solusi Edukasi.</w:t>
-      </w:r>
     </w:p>
     <w:p>
       <w:pPr>
@@ -3869,7 +3952,99 @@
           <w:sz w:val="24"/>
           <w:szCs w:val="24"/>
         </w:rPr>
-        <w:t>Penulis juga berharap hasil penelitian ini dapat menjadi kontribusi nyata bagi pengembangan media pembelajaran di bidang sensor dan aktuator, serta dapat memperkuat kerja sama antara Universitas Negeri Yogyakarta dan CV Global Solusi Edukasi dalam bidang pengembangan media pembelajaran. Semoga hasil penelitian ini dapat digunakan secara berkelanjutan dan memberikan manfaat jangka panjang bagi kedua belah pihak.</w:t>
+        <w:t>Besar harapan penulis agar proposal pengajuan dana ini dapat disetujui dan didukung oleh CV Global Solusi Edukasi. Dukungan tersebut akan sangat berarti bagi kelancaran penelitian dan pengembangan media pembelajaran ini, terutama dalam hal pengadaan komponen-komponen yang dibutuhkan untuk pembuatan trainer kit. Dengan dukungan tersebut, penelitian ini diharapkan dapat menghasilkan produk media pembelajaran yang valid, praktis, dan bermanfaat bagi peserta didik jenjang menengah di CV Global Solusi Edukasi.</w:t>
+      </w:r>
+    </w:p>
+    <w:p>
+      <w:pPr>
+        <w:spacing w:line="480" w:lineRule="auto"/>
+        <w:ind w:left="720" w:firstLine="720"/>
+        <w:jc w:val="both"/>
+        <w:rPr>
+          <w:rFonts w:ascii="Times New Roman" w:eastAsia="Times New Roman" w:hAnsi="Times New Roman" w:cs="Times New Roman"/>
+          <w:sz w:val="24"/>
+          <w:szCs w:val="24"/>
+        </w:rPr>
+      </w:pPr>
+      <w:r>
+        <w:rPr>
+          <w:rFonts w:ascii="Times New Roman" w:eastAsia="Times New Roman" w:hAnsi="Times New Roman" w:cs="Times New Roman"/>
+          <w:sz w:val="24"/>
+          <w:szCs w:val="24"/>
+        </w:rPr>
+        <w:t xml:space="preserve">Penelitian ini ditargetkan selesai </w:t>
+      </w:r>
+      <w:r>
+        <w:rPr>
+          <w:rFonts w:ascii="Times New Roman" w:eastAsia="Times New Roman" w:hAnsi="Times New Roman" w:cs="Times New Roman"/>
+          <w:b/>
+          <w:bCs/>
+          <w:sz w:val="24"/>
+          <w:szCs w:val="24"/>
+        </w:rPr>
+        <w:t>sebelum</w:t>
+      </w:r>
+      <w:r>
+        <w:rPr>
+          <w:rFonts w:ascii="Times New Roman" w:eastAsia="Times New Roman" w:hAnsi="Times New Roman" w:cs="Times New Roman"/>
+          <w:sz w:val="24"/>
+          <w:szCs w:val="24"/>
+        </w:rPr>
+        <w:t xml:space="preserve"> bulan </w:t>
+      </w:r>
+      <w:r>
+        <w:rPr>
+          <w:rFonts w:ascii="Times New Roman" w:eastAsia="Times New Roman" w:hAnsi="Times New Roman" w:cs="Times New Roman"/>
+          <w:b/>
+          <w:bCs/>
+          <w:sz w:val="24"/>
+          <w:szCs w:val="24"/>
+        </w:rPr>
+        <w:t>Desember 2026</w:t>
+      </w:r>
+      <w:r>
+        <w:rPr>
+          <w:rFonts w:ascii="Times New Roman" w:eastAsia="Times New Roman" w:hAnsi="Times New Roman" w:cs="Times New Roman"/>
+          <w:sz w:val="24"/>
+          <w:szCs w:val="24"/>
+        </w:rPr>
+        <w:t xml:space="preserve">, dengan rincian jadwal sebagai berikut: </w:t>
+      </w:r>
+      <w:r>
+        <w:rPr>
+          <w:rFonts w:ascii="Times New Roman" w:eastAsia="Times New Roman" w:hAnsi="Times New Roman" w:cs="Times New Roman"/>
+          <w:b/>
+          <w:bCs/>
+          <w:sz w:val="24"/>
+          <w:szCs w:val="24"/>
+        </w:rPr>
+        <w:t>yudisium dan pelantikan PSPPI I pada 18 Desember 2026</w:t>
+      </w:r>
+      <w:r>
+        <w:rPr>
+          <w:rFonts w:ascii="Times New Roman" w:eastAsia="Times New Roman" w:hAnsi="Times New Roman" w:cs="Times New Roman"/>
+          <w:sz w:val="24"/>
+          <w:szCs w:val="24"/>
+        </w:rPr>
+        <w:t xml:space="preserve">, serta </w:t>
+      </w:r>
+      <w:r>
+        <w:rPr>
+          <w:rFonts w:ascii="Times New Roman" w:eastAsia="Times New Roman" w:hAnsi="Times New Roman" w:cs="Times New Roman"/>
+          <w:b/>
+          <w:bCs/>
+          <w:sz w:val="24"/>
+          <w:szCs w:val="24"/>
+        </w:rPr>
+        <w:t>wisuda periode III pada 23 Desember 2026</w:t>
+      </w:r>
+      <w:r>
+        <w:rPr>
+          <w:rFonts w:ascii="Times New Roman" w:eastAsia="Times New Roman" w:hAnsi="Times New Roman" w:cs="Times New Roman"/>
+          <w:sz w:val="24"/>
+          <w:szCs w:val="24"/>
+        </w:rPr>
+        <w:t>. Target penyelesaian ini menjadi acuan dalam penyusunan jadwal penelitian, sehingga seluruh tahapan penelitian dapat diselesaikan tepat waktu dan produk trainer kit dapat segera dimanfaatkan untuk kegiatan pembelajaran di kelas Robot Inovasi.</w:t>
       </w:r>
     </w:p>
     <w:p>
@@ -3939,13 +4114,6 @@
                 <w:szCs w:val="24"/>
               </w:rPr>
               <w:br/>
-            </w:r>
-            <w:r>
-              <w:rPr>
-                <w:rFonts w:ascii="Times New Roman" w:eastAsia="Times New Roman" w:hAnsi="Times New Roman" w:cs="Times New Roman"/>
-                <w:sz w:val="24"/>
-                <w:szCs w:val="24"/>
-              </w:rPr>
               <w:t>Penulis,</w:t>
             </w:r>
           </w:p>
@@ -3971,6 +4139,7 @@
             <w:r>
               <w:rPr>
                 <w:rFonts w:ascii="Times New Roman" w:eastAsia="Times New Roman" w:hAnsi="Times New Roman" w:cs="Times New Roman"/>
+                <w:noProof/>
                 <w:sz w:val="24"/>
                 <w:szCs w:val="24"/>
               </w:rPr>
@@ -4080,24 +4249,540 @@
     <w:p>
       <w:pPr>
         <w:spacing w:line="480" w:lineRule="auto"/>
-        <w:ind w:left="720"/>
-        <w:jc w:val="both"/>
-        <w:rPr>
-          <w:rFonts w:ascii="Times New Roman" w:eastAsia="Times New Roman" w:hAnsi="Times New Roman" w:cs="Times New Roman"/>
-          <w:sz w:val="24"/>
-          <w:szCs w:val="24"/>
-        </w:rPr>
-      </w:pPr>
-    </w:p>
-    <w:p>
-      <w:pPr>
-        <w:spacing w:line="480" w:lineRule="auto"/>
-        <w:rPr>
-          <w:rFonts w:ascii="Times New Roman" w:eastAsia="Times New Roman" w:hAnsi="Times New Roman" w:cs="Times New Roman"/>
-          <w:sz w:val="24"/>
-          <w:szCs w:val="24"/>
-        </w:rPr>
-      </w:pPr>
+        <w:rPr>
+          <w:rFonts w:ascii="Times New Roman" w:eastAsia="Times New Roman" w:hAnsi="Times New Roman" w:cs="Times New Roman"/>
+          <w:sz w:val="24"/>
+          <w:szCs w:val="24"/>
+        </w:rPr>
+      </w:pPr>
+    </w:p>
+    <w:p>
+      <w:pPr>
+        <w:pStyle w:val="ListParagraph"/>
+        <w:numPr>
+          <w:ilvl w:val="0"/>
+          <w:numId w:val="6"/>
+        </w:numPr>
+        <w:spacing w:line="480" w:lineRule="auto"/>
+        <w:rPr>
+          <w:rFonts w:ascii="Times New Roman" w:eastAsia="Times New Roman" w:hAnsi="Times New Roman" w:cs="Times New Roman"/>
+          <w:b/>
+          <w:bCs/>
+          <w:sz w:val="24"/>
+          <w:szCs w:val="24"/>
+        </w:rPr>
+      </w:pPr>
+      <w:r>
+        <w:rPr>
+          <w:rFonts w:ascii="Times New Roman" w:eastAsia="Times New Roman" w:hAnsi="Times New Roman" w:cs="Times New Roman"/>
+          <w:b/>
+          <w:bCs/>
+          <w:sz w:val="24"/>
+          <w:szCs w:val="24"/>
+        </w:rPr>
+        <w:lastRenderedPageBreak/>
+        <w:t>Lampiran</w:t>
+      </w:r>
+    </w:p>
+    <w:p>
+      <w:pPr>
+        <w:pStyle w:val="ListParagraph"/>
+        <w:numPr>
+          <w:ilvl w:val="3"/>
+          <w:numId w:val="6"/>
+        </w:numPr>
+        <w:spacing w:line="480" w:lineRule="auto"/>
+        <w:ind w:left="1134"/>
+        <w:rPr>
+          <w:rFonts w:ascii="Times New Roman" w:eastAsia="Times New Roman" w:hAnsi="Times New Roman" w:cs="Times New Roman"/>
+          <w:sz w:val="24"/>
+          <w:szCs w:val="24"/>
+        </w:rPr>
+      </w:pPr>
+      <w:r>
+        <w:rPr>
+          <w:rFonts w:ascii="Times New Roman" w:eastAsia="Times New Roman" w:hAnsi="Times New Roman" w:cs="Times New Roman"/>
+          <w:sz w:val="24"/>
+          <w:szCs w:val="24"/>
+        </w:rPr>
+        <w:t>Bukti ACC Judul dan Dosen Pembimbing</w:t>
+      </w:r>
+    </w:p>
+    <w:p>
+      <w:pPr>
+        <w:pStyle w:val="ListParagraph"/>
+        <w:spacing w:line="480" w:lineRule="auto"/>
+        <w:ind w:left="1134"/>
+        <w:rPr>
+          <w:rFonts w:ascii="Times New Roman" w:eastAsia="Times New Roman" w:hAnsi="Times New Roman" w:cs="Times New Roman"/>
+          <w:sz w:val="24"/>
+          <w:szCs w:val="24"/>
+        </w:rPr>
+      </w:pPr>
+      <w:r>
+        <w:rPr>
+          <w:rFonts w:ascii="Times New Roman" w:eastAsia="Times New Roman" w:hAnsi="Times New Roman" w:cs="Times New Roman"/>
+          <w:noProof/>
+          <w:sz w:val="24"/>
+          <w:szCs w:val="24"/>
+        </w:rPr>
+        <w:drawing>
+          <wp:inline distT="0" distB="0" distL="0" distR="0" wp14:anchorId="7043752C" wp14:editId="1AC287C7">
+            <wp:extent cx="5220000" cy="1606643"/>
+            <wp:effectExtent l="0" t="0" r="0" b="0"/>
+            <wp:docPr id="1030169271" name="Picture 1"/>
+            <wp:cNvGraphicFramePr>
+              <a:graphicFrameLocks xmlns:a="http://schemas.openxmlformats.org/drawingml/2006/main" noChangeAspect="1"/>
+            </wp:cNvGraphicFramePr>
+            <a:graphic xmlns:a="http://schemas.openxmlformats.org/drawingml/2006/main">
+              <a:graphicData uri="http://schemas.openxmlformats.org/drawingml/2006/picture">
+                <pic:pic xmlns:pic="http://schemas.openxmlformats.org/drawingml/2006/picture">
+                  <pic:nvPicPr>
+                    <pic:cNvPr id="1030169271" name=""/>
+                    <pic:cNvPicPr/>
+                  </pic:nvPicPr>
+                  <pic:blipFill>
+                    <a:blip r:embed="rId9"/>
+                    <a:stretch>
+                      <a:fillRect/>
+                    </a:stretch>
+                  </pic:blipFill>
+                  <pic:spPr>
+                    <a:xfrm>
+                      <a:off x="0" y="0"/>
+                      <a:ext cx="5220000" cy="1606643"/>
+                    </a:xfrm>
+                    <a:prstGeom prst="rect">
+                      <a:avLst/>
+                    </a:prstGeom>
+                  </pic:spPr>
+                </pic:pic>
+              </a:graphicData>
+            </a:graphic>
+          </wp:inline>
+        </w:drawing>
+      </w:r>
+    </w:p>
+    <w:p>
+      <w:pPr>
+        <w:pStyle w:val="ListParagraph"/>
+        <w:spacing w:line="480" w:lineRule="auto"/>
+        <w:ind w:left="1134"/>
+        <w:rPr>
+          <w:rFonts w:ascii="Times New Roman" w:eastAsia="Times New Roman" w:hAnsi="Times New Roman" w:cs="Times New Roman"/>
+          <w:sz w:val="24"/>
+          <w:szCs w:val="24"/>
+        </w:rPr>
+      </w:pPr>
+      <w:r>
+        <w:rPr>
+          <w:rFonts w:ascii="Times New Roman" w:eastAsia="Times New Roman" w:hAnsi="Times New Roman" w:cs="Times New Roman"/>
+          <w:noProof/>
+          <w:sz w:val="24"/>
+          <w:szCs w:val="24"/>
+        </w:rPr>
+        <w:drawing>
+          <wp:inline distT="0" distB="0" distL="0" distR="0" wp14:anchorId="7D2E73E0" wp14:editId="2D031263">
+            <wp:extent cx="5220000" cy="2134726"/>
+            <wp:effectExtent l="0" t="0" r="0" b="0"/>
+            <wp:docPr id="1239737783" name="Picture 1"/>
+            <wp:cNvGraphicFramePr>
+              <a:graphicFrameLocks xmlns:a="http://schemas.openxmlformats.org/drawingml/2006/main" noChangeAspect="1"/>
+            </wp:cNvGraphicFramePr>
+            <a:graphic xmlns:a="http://schemas.openxmlformats.org/drawingml/2006/main">
+              <a:graphicData uri="http://schemas.openxmlformats.org/drawingml/2006/picture">
+                <pic:pic xmlns:pic="http://schemas.openxmlformats.org/drawingml/2006/picture">
+                  <pic:nvPicPr>
+                    <pic:cNvPr id="1239737783" name=""/>
+                    <pic:cNvPicPr/>
+                  </pic:nvPicPr>
+                  <pic:blipFill rotWithShape="1">
+                    <a:blip r:embed="rId10"/>
+                    <a:srcRect l="634"/>
+                    <a:stretch>
+                      <a:fillRect/>
+                    </a:stretch>
+                  </pic:blipFill>
+                  <pic:spPr bwMode="auto">
+                    <a:xfrm>
+                      <a:off x="0" y="0"/>
+                      <a:ext cx="5220000" cy="2134726"/>
+                    </a:xfrm>
+                    <a:prstGeom prst="rect">
+                      <a:avLst/>
+                    </a:prstGeom>
+                    <a:ln>
+                      <a:noFill/>
+                    </a:ln>
+                    <a:extLst>
+                      <a:ext uri="{53640926-AAD7-44D8-BBD7-CCE9431645EC}">
+                        <a14:shadowObscured xmlns:a14="http://schemas.microsoft.com/office/drawing/2010/main"/>
+                      </a:ext>
+                    </a:extLst>
+                  </pic:spPr>
+                </pic:pic>
+              </a:graphicData>
+            </a:graphic>
+          </wp:inline>
+        </w:drawing>
+      </w:r>
+    </w:p>
+    <w:p>
+      <w:pPr>
+        <w:pStyle w:val="ListParagraph"/>
+        <w:spacing w:line="480" w:lineRule="auto"/>
+        <w:ind w:left="1134"/>
+        <w:rPr>
+          <w:rFonts w:ascii="Times New Roman" w:eastAsia="Times New Roman" w:hAnsi="Times New Roman" w:cs="Times New Roman"/>
+          <w:sz w:val="24"/>
+          <w:szCs w:val="24"/>
+        </w:rPr>
+      </w:pPr>
+      <w:r>
+        <w:rPr>
+          <w:rFonts w:ascii="Times New Roman" w:eastAsia="Times New Roman" w:hAnsi="Times New Roman" w:cs="Times New Roman"/>
+          <w:sz w:val="24"/>
+          <w:szCs w:val="24"/>
+        </w:rPr>
+        <w:drawing>
+          <wp:inline distT="0" distB="0" distL="0" distR="0" wp14:anchorId="589F85FE" wp14:editId="2AE67B16">
+            <wp:extent cx="5220000" cy="2475005"/>
+            <wp:effectExtent l="0" t="0" r="0" b="1905"/>
+            <wp:docPr id="537616939" name="Picture 1"/>
+            <wp:cNvGraphicFramePr>
+              <a:graphicFrameLocks xmlns:a="http://schemas.openxmlformats.org/drawingml/2006/main" noChangeAspect="1"/>
+            </wp:cNvGraphicFramePr>
+            <a:graphic xmlns:a="http://schemas.openxmlformats.org/drawingml/2006/main">
+              <a:graphicData uri="http://schemas.openxmlformats.org/drawingml/2006/picture">
+                <pic:pic xmlns:pic="http://schemas.openxmlformats.org/drawingml/2006/picture">
+                  <pic:nvPicPr>
+                    <pic:cNvPr id="537616939" name=""/>
+                    <pic:cNvPicPr/>
+                  </pic:nvPicPr>
+                  <pic:blipFill>
+                    <a:blip r:embed="rId11"/>
+                    <a:stretch>
+                      <a:fillRect/>
+                    </a:stretch>
+                  </pic:blipFill>
+                  <pic:spPr>
+                    <a:xfrm>
+                      <a:off x="0" y="0"/>
+                      <a:ext cx="5220000" cy="2475005"/>
+                    </a:xfrm>
+                    <a:prstGeom prst="rect">
+                      <a:avLst/>
+                    </a:prstGeom>
+                  </pic:spPr>
+                </pic:pic>
+              </a:graphicData>
+            </a:graphic>
+          </wp:inline>
+        </w:drawing>
+      </w:r>
+    </w:p>
+    <w:p>
+      <w:pPr>
+        <w:rPr>
+          <w:rFonts w:ascii="Times New Roman" w:eastAsia="Times New Roman" w:hAnsi="Times New Roman" w:cs="Times New Roman"/>
+          <w:sz w:val="24"/>
+          <w:szCs w:val="24"/>
+        </w:rPr>
+      </w:pPr>
+      <w:r>
+        <w:rPr>
+          <w:rFonts w:ascii="Times New Roman" w:eastAsia="Times New Roman" w:hAnsi="Times New Roman" w:cs="Times New Roman"/>
+          <w:sz w:val="24"/>
+          <w:szCs w:val="24"/>
+        </w:rPr>
+        <w:br w:type="page"/>
+      </w:r>
+    </w:p>
+    <w:p>
+      <w:pPr>
+        <w:pStyle w:val="ListParagraph"/>
+        <w:numPr>
+          <w:ilvl w:val="3"/>
+          <w:numId w:val="6"/>
+        </w:numPr>
+        <w:spacing w:line="480" w:lineRule="auto"/>
+        <w:ind w:left="1134"/>
+        <w:rPr>
+          <w:rFonts w:ascii="Times New Roman" w:eastAsia="Times New Roman" w:hAnsi="Times New Roman" w:cs="Times New Roman"/>
+          <w:sz w:val="24"/>
+          <w:szCs w:val="24"/>
+        </w:rPr>
+      </w:pPr>
+      <w:r>
+        <w:rPr>
+          <w:rFonts w:ascii="Times New Roman" w:eastAsia="Times New Roman" w:hAnsi="Times New Roman" w:cs="Times New Roman"/>
+          <w:sz w:val="24"/>
+          <w:szCs w:val="24"/>
+        </w:rPr>
+        <w:lastRenderedPageBreak/>
+        <w:t>Referensi Trainer Kit Multi Sensor</w:t>
+      </w:r>
+    </w:p>
+    <w:p>
+      <w:pPr>
+        <w:pStyle w:val="ListParagraph"/>
+        <w:spacing w:line="480" w:lineRule="auto"/>
+        <w:ind w:left="1134"/>
+        <w:rPr>
+          <w:rFonts w:ascii="Times New Roman" w:eastAsia="Times New Roman" w:hAnsi="Times New Roman" w:cs="Times New Roman"/>
+          <w:sz w:val="24"/>
+          <w:szCs w:val="24"/>
+        </w:rPr>
+      </w:pPr>
+      <w:r>
+        <w:rPr>
+          <w:noProof/>
+        </w:rPr>
+        <w:drawing>
+          <wp:inline distT="0" distB="0" distL="0" distR="0" wp14:anchorId="1DA90374" wp14:editId="1D3C988F">
+            <wp:extent cx="5220000" cy="3479807"/>
+            <wp:effectExtent l="0" t="0" r="0" b="6350"/>
+            <wp:docPr id="1096528315" name="Picture 1" descr="Detail Produk | Elmech - Your Innovation Partner | Jasa Pemrograman Arduino,  PLC Terbaik"/>
+            <wp:cNvGraphicFramePr>
+              <a:graphicFrameLocks xmlns:a="http://schemas.openxmlformats.org/drawingml/2006/main" noChangeAspect="1"/>
+            </wp:cNvGraphicFramePr>
+            <a:graphic xmlns:a="http://schemas.openxmlformats.org/drawingml/2006/main">
+              <a:graphicData uri="http://schemas.openxmlformats.org/drawingml/2006/picture">
+                <pic:pic xmlns:pic="http://schemas.openxmlformats.org/drawingml/2006/picture">
+                  <pic:nvPicPr>
+                    <pic:cNvPr id="0" name="Picture 1" descr="Detail Produk | Elmech - Your Innovation Partner | Jasa Pemrograman Arduino,  PLC Terbaik"/>
+                    <pic:cNvPicPr>
+                      <a:picLocks noChangeAspect="1" noChangeArrowheads="1"/>
+                    </pic:cNvPicPr>
+                  </pic:nvPicPr>
+                  <pic:blipFill>
+                    <a:blip r:embed="rId12" cstate="print">
+                      <a:extLst>
+                        <a:ext uri="{28A0092B-C50C-407E-A947-70E740481C1C}">
+                          <a14:useLocalDpi xmlns:a14="http://schemas.microsoft.com/office/drawing/2010/main" val="0"/>
+                        </a:ext>
+                      </a:extLst>
+                    </a:blip>
+                    <a:srcRect/>
+                    <a:stretch>
+                      <a:fillRect/>
+                    </a:stretch>
+                  </pic:blipFill>
+                  <pic:spPr bwMode="auto">
+                    <a:xfrm>
+                      <a:off x="0" y="0"/>
+                      <a:ext cx="5220000" cy="3479807"/>
+                    </a:xfrm>
+                    <a:prstGeom prst="rect">
+                      <a:avLst/>
+                    </a:prstGeom>
+                    <a:noFill/>
+                    <a:ln>
+                      <a:noFill/>
+                    </a:ln>
+                  </pic:spPr>
+                </pic:pic>
+              </a:graphicData>
+            </a:graphic>
+          </wp:inline>
+        </w:drawing>
+      </w:r>
+    </w:p>
+    <w:p>
+      <w:pPr>
+        <w:pStyle w:val="ListParagraph"/>
+        <w:numPr>
+          <w:ilvl w:val="3"/>
+          <w:numId w:val="6"/>
+        </w:numPr>
+        <w:spacing w:line="480" w:lineRule="auto"/>
+        <w:ind w:left="1134" w:firstLine="0"/>
+        <w:rPr>
+          <w:rFonts w:ascii="Times New Roman" w:eastAsia="Times New Roman" w:hAnsi="Times New Roman" w:cs="Times New Roman"/>
+          <w:sz w:val="24"/>
+          <w:szCs w:val="24"/>
+        </w:rPr>
+      </w:pPr>
+      <w:r>
+        <w:rPr>
+          <w:rFonts w:ascii="Times New Roman" w:eastAsia="Times New Roman" w:hAnsi="Times New Roman" w:cs="Times New Roman"/>
+          <w:sz w:val="24"/>
+          <w:szCs w:val="24"/>
+        </w:rPr>
+        <w:t xml:space="preserve">Desain Kasar Trainer Kit </w:t>
+      </w:r>
+      <w:r>
+        <w:rPr>
+          <w:rFonts w:ascii="Times New Roman" w:eastAsia="Times New Roman" w:hAnsi="Times New Roman" w:cs="Times New Roman"/>
+          <w:sz w:val="24"/>
+          <w:szCs w:val="24"/>
+        </w:rPr>
+        <w:t xml:space="preserve">Multi Sensor </w:t>
+      </w:r>
+    </w:p>
+    <w:p>
+      <w:pPr>
+        <w:pStyle w:val="ListParagraph"/>
+        <w:spacing w:line="480" w:lineRule="auto"/>
+        <w:ind w:left="1134"/>
+        <w:rPr>
+          <w:rFonts w:ascii="Times New Roman" w:eastAsia="Times New Roman" w:hAnsi="Times New Roman" w:cs="Times New Roman"/>
+          <w:sz w:val="24"/>
+          <w:szCs w:val="24"/>
+        </w:rPr>
+      </w:pPr>
+      <w:r>
+        <w:rPr>
+          <w:rFonts w:ascii="Times New Roman" w:eastAsia="Times New Roman" w:hAnsi="Times New Roman" w:cs="Times New Roman"/>
+          <w:noProof/>
+          <w:sz w:val="24"/>
+          <w:szCs w:val="24"/>
+        </w:rPr>
+        <w:drawing>
+          <wp:inline distT="0" distB="0" distL="0" distR="0" wp14:anchorId="3897453B" wp14:editId="127E38F2">
+            <wp:extent cx="5220000" cy="3595266"/>
+            <wp:effectExtent l="0" t="0" r="0" b="5715"/>
+            <wp:docPr id="745110843" name="Picture 2"/>
+            <wp:cNvGraphicFramePr>
+              <a:graphicFrameLocks xmlns:a="http://schemas.openxmlformats.org/drawingml/2006/main" noChangeAspect="1"/>
+            </wp:cNvGraphicFramePr>
+            <a:graphic xmlns:a="http://schemas.openxmlformats.org/drawingml/2006/main">
+              <a:graphicData uri="http://schemas.openxmlformats.org/drawingml/2006/picture">
+                <pic:pic xmlns:pic="http://schemas.openxmlformats.org/drawingml/2006/picture">
+                  <pic:nvPicPr>
+                    <pic:cNvPr id="0" name="Picture 3"/>
+                    <pic:cNvPicPr>
+                      <a:picLocks noChangeAspect="1" noChangeArrowheads="1"/>
+                    </pic:cNvPicPr>
+                  </pic:nvPicPr>
+                  <pic:blipFill>
+                    <a:blip r:embed="rId13">
+                      <a:extLst>
+                        <a:ext uri="{28A0092B-C50C-407E-A947-70E740481C1C}">
+                          <a14:useLocalDpi xmlns:a14="http://schemas.microsoft.com/office/drawing/2010/main" val="0"/>
+                        </a:ext>
+                      </a:extLst>
+                    </a:blip>
+                    <a:srcRect/>
+                    <a:stretch>
+                      <a:fillRect/>
+                    </a:stretch>
+                  </pic:blipFill>
+                  <pic:spPr bwMode="auto">
+                    <a:xfrm>
+                      <a:off x="0" y="0"/>
+                      <a:ext cx="5220000" cy="3595266"/>
+                    </a:xfrm>
+                    <a:prstGeom prst="rect">
+                      <a:avLst/>
+                    </a:prstGeom>
+                    <a:noFill/>
+                    <a:ln>
+                      <a:noFill/>
+                    </a:ln>
+                  </pic:spPr>
+                </pic:pic>
+              </a:graphicData>
+            </a:graphic>
+          </wp:inline>
+        </w:drawing>
+      </w:r>
+    </w:p>
+    <w:p>
+      <w:pPr>
+        <w:rPr>
+          <w:rFonts w:ascii="Times New Roman" w:eastAsia="Times New Roman" w:hAnsi="Times New Roman" w:cs="Times New Roman"/>
+          <w:sz w:val="24"/>
+          <w:szCs w:val="24"/>
+        </w:rPr>
+      </w:pPr>
+      <w:r>
+        <w:rPr>
+          <w:rFonts w:ascii="Times New Roman" w:eastAsia="Times New Roman" w:hAnsi="Times New Roman" w:cs="Times New Roman"/>
+          <w:sz w:val="24"/>
+          <w:szCs w:val="24"/>
+        </w:rPr>
+        <w:br w:type="page"/>
+      </w:r>
+    </w:p>
+    <w:p>
+      <w:pPr>
+        <w:pStyle w:val="ListParagraph"/>
+        <w:numPr>
+          <w:ilvl w:val="3"/>
+          <w:numId w:val="6"/>
+        </w:numPr>
+        <w:spacing w:line="480" w:lineRule="auto"/>
+        <w:ind w:left="1418"/>
+        <w:rPr>
+          <w:rFonts w:ascii="Times New Roman" w:eastAsia="Times New Roman" w:hAnsi="Times New Roman" w:cs="Times New Roman"/>
+          <w:sz w:val="24"/>
+          <w:szCs w:val="24"/>
+        </w:rPr>
+      </w:pPr>
+      <w:r>
+        <w:rPr>
+          <w:rFonts w:ascii="Times New Roman" w:eastAsia="Times New Roman" w:hAnsi="Times New Roman" w:cs="Times New Roman"/>
+          <w:sz w:val="24"/>
+          <w:szCs w:val="24"/>
+        </w:rPr>
+        <w:lastRenderedPageBreak/>
+        <w:t>Kalender Akademik 2026 – 2027</w:t>
+      </w:r>
+    </w:p>
+    <w:p>
+      <w:pPr>
+        <w:pStyle w:val="ListParagraph"/>
+        <w:spacing w:line="480" w:lineRule="auto"/>
+        <w:ind w:left="1418"/>
+        <w:rPr>
+          <w:rFonts w:ascii="Times New Roman" w:eastAsia="Times New Roman" w:hAnsi="Times New Roman" w:cs="Times New Roman"/>
+          <w:sz w:val="24"/>
+          <w:szCs w:val="24"/>
+        </w:rPr>
+      </w:pPr>
+      <w:r>
+        <w:rPr>
+          <w:rFonts w:ascii="Times New Roman" w:eastAsia="Times New Roman" w:hAnsi="Times New Roman" w:cs="Times New Roman"/>
+          <w:sz w:val="24"/>
+          <w:szCs w:val="24"/>
+        </w:rPr>
+        <w:drawing>
+          <wp:inline distT="0" distB="0" distL="0" distR="0" wp14:anchorId="04215A51" wp14:editId="7ECA162D">
+            <wp:extent cx="5040000" cy="7979179"/>
+            <wp:effectExtent l="0" t="0" r="8255" b="3175"/>
+            <wp:docPr id="53934870" name="Picture 1"/>
+            <wp:cNvGraphicFramePr>
+              <a:graphicFrameLocks xmlns:a="http://schemas.openxmlformats.org/drawingml/2006/main" noChangeAspect="1"/>
+            </wp:cNvGraphicFramePr>
+            <a:graphic xmlns:a="http://schemas.openxmlformats.org/drawingml/2006/main">
+              <a:graphicData uri="http://schemas.openxmlformats.org/drawingml/2006/picture">
+                <pic:pic xmlns:pic="http://schemas.openxmlformats.org/drawingml/2006/picture">
+                  <pic:nvPicPr>
+                    <pic:cNvPr id="53934870" name=""/>
+                    <pic:cNvPicPr/>
+                  </pic:nvPicPr>
+                  <pic:blipFill>
+                    <a:blip r:embed="rId14"/>
+                    <a:stretch>
+                      <a:fillRect/>
+                    </a:stretch>
+                  </pic:blipFill>
+                  <pic:spPr>
+                    <a:xfrm>
+                      <a:off x="0" y="0"/>
+                      <a:ext cx="5040000" cy="7979179"/>
+                    </a:xfrm>
+                    <a:prstGeom prst="rect">
+                      <a:avLst/>
+                    </a:prstGeom>
+                  </pic:spPr>
+                </pic:pic>
+              </a:graphicData>
+            </a:graphic>
+          </wp:inline>
+        </w:drawing>
+      </w:r>
     </w:p>
     <w:sectPr>
       <w:pgSz w:w="11909" w:h="16834"/>
@@ -5421,6 +6106,17 @@
       </w:tblBorders>
     </w:tblPr>
   </w:style>
+  <w:style w:type="paragraph" w:styleId="ListParagraph">
+    <w:name w:val="List Paragraph"/>
+    <w:basedOn w:val="Normal"/>
+    <w:uiPriority w:val="34"/>
+    <w:qFormat/>
+    <w:rsid w:val="001B2A54"/>
+    <w:pPr>
+      <w:ind w:left="720"/>
+      <w:contextualSpacing/>
+    </w:pPr>
+  </w:style>
 </w:styles>
 </file>
 

</xml_diff>